<commit_message>
Update thesis manuscript (date format and PDF re-export)
</commit_message>
<xml_diff>
--- a/thesis/Thesis_MSc_ADS_4266390.docx
+++ b/thesis/Thesis_MSc_ADS_4266390.docx
@@ -18,7 +18,7 @@
               <w:noProof/>
             </w:rPr>
             <w:drawing>
-              <wp:inline distT="0" distB="0" distL="0" distR="0" wp14:anchorId="329EC9F9" wp14:editId="7049CC1C">
+              <wp:inline distT="0" distB="0" distL="0" distR="0" wp14:anchorId="329EC9F9" wp14:editId="497B9FE1">
                 <wp:extent cx="4105664" cy="1621539"/>
                 <wp:effectExtent l="0" t="0" r="0" b="0"/>
                 <wp:docPr id="644019281" name="Picture 1"/>
@@ -331,7 +331,7 @@
                         <w:sz w:val="28"/>
                         <w:szCs w:val="28"/>
                       </w:rPr>
-                      <w:t>29-06-2026</w:t>
+                      <w:t>6-29-2026</w:t>
                     </w:r>
                   </w:p>
                 </w:sdtContent>
@@ -445,15 +445,7 @@
         </m:r>
       </m:oMath>
       <w:r>
-        <w:t xml:space="preserve"> events) are perturbed by randomly tagging an additional receiver onto a controlled proportion of events, the dyadic transformation is applied, and the refitted REM coefficients are compared against the known truth across 28 independent baseline datasets, with a native Relational Hyperevent Model reported as a contextual benchmark. Acceptability is judged by a pre-specified per-effect recovery-noise band. The result is a three-zone operating range: recovery is reliable up to a multi-r</w:t>
-      </w:r>
-      <w:proofErr w:type="spellStart"/>
-      <w:r>
-        <w:t>eceiver</w:t>
-      </w:r>
-      <w:proofErr w:type="spellEnd"/>
-      <w:r>
-        <w:t xml:space="preserve"> share of about 8%, borderline between 8% and roughly 12%, and unreliable above 12%, with the triadic outgoing-two-paths effect binding first. For shares above roughly 12% we recommend a native multi-receiver model such as the relational hyperevent model, a restructuring of the data, or another estimator designed for polyadic events, in place of the dyadic transformation.</w:t>
+        <w:t xml:space="preserve"> events) are perturbed by randomly tagging an additional receiver onto a controlled proportion of events, the dyadic transformation is applied, and the refitted REM coefficients are compared against the known truth across 28 independent baseline datasets, with a native Relational Hyperevent Model reported as a contextual benchmark. Acceptability is judged by a pre-specified per-effect recovery-noise band. The result is a three-zone operating range: recovery is reliable up to a multi-receiver share of about 8%, borderline between 8% and roughly 12%, and unreliable above 12%, with the triadic outgoing-two-paths effect binding first. For shares above roughly 12% we recommend a native multi-receiver model such as the relational hyperevent model, a restructuring of the data, or another estimator designed for polyadic events, in place of the dyadic transformation.</w:t>
       </w:r>
     </w:p>
     <w:p>
@@ -553,7 +545,6 @@
               <w:kern w:val="2"/>
               <w:sz w:val="20"/>
               <w:szCs w:val="20"/>
-              <w:lang/>
               <w14:ligatures w14:val="standardContextual"/>
             </w:rPr>
           </w:pPr>
@@ -573,7 +564,6 @@
                 <w:kern w:val="2"/>
                 <w:sz w:val="20"/>
                 <w:szCs w:val="20"/>
-                <w:lang/>
                 <w14:ligatures w14:val="standardContextual"/>
               </w:rPr>
               <w:tab/>
@@ -663,7 +653,6 @@
               <w:kern w:val="2"/>
               <w:sz w:val="20"/>
               <w:szCs w:val="20"/>
-              <w:lang/>
               <w14:ligatures w14:val="standardContextual"/>
             </w:rPr>
           </w:pPr>
@@ -683,7 +672,6 @@
                 <w:kern w:val="2"/>
                 <w:sz w:val="20"/>
                 <w:szCs w:val="20"/>
-                <w:lang/>
                 <w14:ligatures w14:val="standardContextual"/>
               </w:rPr>
               <w:tab/>
@@ -773,7 +761,6 @@
               <w:kern w:val="2"/>
               <w:sz w:val="20"/>
               <w:szCs w:val="20"/>
-              <w:lang/>
               <w14:ligatures w14:val="standardContextual"/>
             </w:rPr>
           </w:pPr>
@@ -793,7 +780,6 @@
                 <w:kern w:val="2"/>
                 <w:sz w:val="20"/>
                 <w:szCs w:val="20"/>
-                <w:lang/>
                 <w14:ligatures w14:val="standardContextual"/>
               </w:rPr>
               <w:tab/>
@@ -883,7 +869,6 @@
               <w:kern w:val="2"/>
               <w:sz w:val="20"/>
               <w:szCs w:val="20"/>
-              <w:lang/>
               <w14:ligatures w14:val="standardContextual"/>
             </w:rPr>
           </w:pPr>
@@ -903,7 +888,6 @@
                 <w:kern w:val="2"/>
                 <w:sz w:val="20"/>
                 <w:szCs w:val="20"/>
-                <w:lang/>
                 <w14:ligatures w14:val="standardContextual"/>
               </w:rPr>
               <w:tab/>
@@ -993,7 +977,6 @@
               <w:kern w:val="2"/>
               <w:sz w:val="20"/>
               <w:szCs w:val="20"/>
-              <w:lang/>
               <w14:ligatures w14:val="standardContextual"/>
             </w:rPr>
           </w:pPr>
@@ -1013,7 +996,6 @@
                 <w:kern w:val="2"/>
                 <w:sz w:val="20"/>
                 <w:szCs w:val="20"/>
-                <w:lang/>
                 <w14:ligatures w14:val="standardContextual"/>
               </w:rPr>
               <w:tab/>
@@ -1103,7 +1085,6 @@
               <w:kern w:val="2"/>
               <w:sz w:val="20"/>
               <w:szCs w:val="20"/>
-              <w:lang/>
               <w14:ligatures w14:val="standardContextual"/>
             </w:rPr>
           </w:pPr>
@@ -1123,7 +1104,6 @@
                 <w:kern w:val="2"/>
                 <w:sz w:val="20"/>
                 <w:szCs w:val="20"/>
-                <w:lang/>
                 <w14:ligatures w14:val="standardContextual"/>
               </w:rPr>
               <w:tab/>
@@ -1213,7 +1193,6 @@
               <w:kern w:val="2"/>
               <w:sz w:val="20"/>
               <w:szCs w:val="20"/>
-              <w:lang/>
               <w14:ligatures w14:val="standardContextual"/>
             </w:rPr>
           </w:pPr>
@@ -1233,7 +1212,6 @@
                 <w:kern w:val="2"/>
                 <w:sz w:val="20"/>
                 <w:szCs w:val="20"/>
-                <w:lang/>
                 <w14:ligatures w14:val="standardContextual"/>
               </w:rPr>
               <w:tab/>
@@ -1323,7 +1301,6 @@
               <w:kern w:val="2"/>
               <w:sz w:val="20"/>
               <w:szCs w:val="20"/>
-              <w:lang/>
               <w14:ligatures w14:val="standardContextual"/>
             </w:rPr>
           </w:pPr>
@@ -1343,7 +1320,6 @@
                 <w:kern w:val="2"/>
                 <w:sz w:val="20"/>
                 <w:szCs w:val="20"/>
-                <w:lang/>
                 <w14:ligatures w14:val="standardContextual"/>
               </w:rPr>
               <w:tab/>
@@ -1433,7 +1409,6 @@
               <w:kern w:val="2"/>
               <w:sz w:val="20"/>
               <w:szCs w:val="20"/>
-              <w:lang/>
               <w14:ligatures w14:val="standardContextual"/>
             </w:rPr>
           </w:pPr>
@@ -1453,7 +1428,6 @@
                 <w:kern w:val="2"/>
                 <w:sz w:val="20"/>
                 <w:szCs w:val="20"/>
-                <w:lang/>
                 <w14:ligatures w14:val="standardContextual"/>
               </w:rPr>
               <w:tab/>
@@ -1543,7 +1517,6 @@
               <w:kern w:val="2"/>
               <w:sz w:val="20"/>
               <w:szCs w:val="20"/>
-              <w:lang/>
               <w14:ligatures w14:val="standardContextual"/>
             </w:rPr>
           </w:pPr>
@@ -1563,7 +1536,6 @@
                 <w:kern w:val="2"/>
                 <w:sz w:val="20"/>
                 <w:szCs w:val="20"/>
-                <w:lang/>
                 <w14:ligatures w14:val="standardContextual"/>
               </w:rPr>
               <w:tab/>
@@ -1653,7 +1625,6 @@
               <w:kern w:val="2"/>
               <w:sz w:val="20"/>
               <w:szCs w:val="20"/>
-              <w:lang/>
               <w14:ligatures w14:val="standardContextual"/>
             </w:rPr>
           </w:pPr>
@@ -1673,7 +1644,6 @@
                 <w:kern w:val="2"/>
                 <w:sz w:val="20"/>
                 <w:szCs w:val="20"/>
-                <w:lang/>
                 <w14:ligatures w14:val="standardContextual"/>
               </w:rPr>
               <w:tab/>
@@ -1763,7 +1733,6 @@
               <w:kern w:val="2"/>
               <w:sz w:val="20"/>
               <w:szCs w:val="20"/>
-              <w:lang/>
               <w14:ligatures w14:val="standardContextual"/>
             </w:rPr>
           </w:pPr>
@@ -1783,7 +1752,6 @@
                 <w:kern w:val="2"/>
                 <w:sz w:val="20"/>
                 <w:szCs w:val="20"/>
-                <w:lang/>
                 <w14:ligatures w14:val="standardContextual"/>
               </w:rPr>
               <w:tab/>
@@ -1873,7 +1841,6 @@
               <w:kern w:val="2"/>
               <w:sz w:val="20"/>
               <w:szCs w:val="20"/>
-              <w:lang/>
               <w14:ligatures w14:val="standardContextual"/>
             </w:rPr>
           </w:pPr>
@@ -1893,7 +1860,6 @@
                 <w:kern w:val="2"/>
                 <w:sz w:val="20"/>
                 <w:szCs w:val="20"/>
-                <w:lang/>
                 <w14:ligatures w14:val="standardContextual"/>
               </w:rPr>
               <w:tab/>
@@ -1983,7 +1949,6 @@
               <w:kern w:val="2"/>
               <w:sz w:val="20"/>
               <w:szCs w:val="20"/>
-              <w:lang/>
               <w14:ligatures w14:val="standardContextual"/>
             </w:rPr>
           </w:pPr>
@@ -2003,7 +1968,6 @@
                 <w:kern w:val="2"/>
                 <w:sz w:val="20"/>
                 <w:szCs w:val="20"/>
-                <w:lang/>
                 <w14:ligatures w14:val="standardContextual"/>
               </w:rPr>
               <w:tab/>
@@ -2093,7 +2057,6 @@
               <w:kern w:val="2"/>
               <w:sz w:val="20"/>
               <w:szCs w:val="20"/>
-              <w:lang/>
               <w14:ligatures w14:val="standardContextual"/>
             </w:rPr>
           </w:pPr>
@@ -2113,7 +2076,6 @@
                 <w:kern w:val="2"/>
                 <w:sz w:val="20"/>
                 <w:szCs w:val="20"/>
-                <w:lang/>
                 <w14:ligatures w14:val="standardContextual"/>
               </w:rPr>
               <w:tab/>
@@ -2203,7 +2165,6 @@
               <w:kern w:val="2"/>
               <w:sz w:val="20"/>
               <w:szCs w:val="20"/>
-              <w:lang/>
               <w14:ligatures w14:val="standardContextual"/>
             </w:rPr>
           </w:pPr>
@@ -2223,7 +2184,6 @@
                 <w:kern w:val="2"/>
                 <w:sz w:val="20"/>
                 <w:szCs w:val="20"/>
-                <w:lang/>
                 <w14:ligatures w14:val="standardContextual"/>
               </w:rPr>
               <w:tab/>
@@ -2313,7 +2273,6 @@
               <w:kern w:val="2"/>
               <w:sz w:val="20"/>
               <w:szCs w:val="20"/>
-              <w:lang/>
               <w14:ligatures w14:val="standardContextual"/>
             </w:rPr>
           </w:pPr>
@@ -2333,7 +2292,6 @@
                 <w:kern w:val="2"/>
                 <w:sz w:val="20"/>
                 <w:szCs w:val="20"/>
-                <w:lang/>
                 <w14:ligatures w14:val="standardContextual"/>
               </w:rPr>
               <w:tab/>
@@ -2423,7 +2381,6 @@
               <w:kern w:val="2"/>
               <w:sz w:val="20"/>
               <w:szCs w:val="20"/>
-              <w:lang/>
               <w14:ligatures w14:val="standardContextual"/>
             </w:rPr>
           </w:pPr>
@@ -2443,7 +2400,6 @@
                 <w:kern w:val="2"/>
                 <w:sz w:val="20"/>
                 <w:szCs w:val="20"/>
-                <w:lang/>
                 <w14:ligatures w14:val="standardContextual"/>
               </w:rPr>
               <w:tab/>
@@ -2533,7 +2489,6 @@
               <w:kern w:val="2"/>
               <w:sz w:val="20"/>
               <w:szCs w:val="20"/>
-              <w:lang/>
               <w14:ligatures w14:val="standardContextual"/>
             </w:rPr>
           </w:pPr>
@@ -2553,7 +2508,6 @@
                 <w:kern w:val="2"/>
                 <w:sz w:val="20"/>
                 <w:szCs w:val="20"/>
-                <w:lang/>
                 <w14:ligatures w14:val="standardContextual"/>
               </w:rPr>
               <w:tab/>
@@ -2643,7 +2597,6 @@
               <w:kern w:val="2"/>
               <w:sz w:val="20"/>
               <w:szCs w:val="20"/>
-              <w:lang/>
               <w14:ligatures w14:val="standardContextual"/>
             </w:rPr>
           </w:pPr>
@@ -2663,7 +2616,6 @@
                 <w:kern w:val="2"/>
                 <w:sz w:val="20"/>
                 <w:szCs w:val="20"/>
-                <w:lang/>
                 <w14:ligatures w14:val="standardContextual"/>
               </w:rPr>
               <w:tab/>
@@ -2753,7 +2705,6 @@
               <w:kern w:val="2"/>
               <w:sz w:val="20"/>
               <w:szCs w:val="20"/>
-              <w:lang/>
               <w14:ligatures w14:val="standardContextual"/>
             </w:rPr>
           </w:pPr>
@@ -2773,7 +2724,6 @@
                 <w:kern w:val="2"/>
                 <w:sz w:val="20"/>
                 <w:szCs w:val="20"/>
-                <w:lang/>
                 <w14:ligatures w14:val="standardContextual"/>
               </w:rPr>
               <w:tab/>
@@ -2863,7 +2813,6 @@
               <w:kern w:val="2"/>
               <w:sz w:val="20"/>
               <w:szCs w:val="20"/>
-              <w:lang/>
               <w14:ligatures w14:val="standardContextual"/>
             </w:rPr>
           </w:pPr>
@@ -2883,7 +2832,6 @@
                 <w:kern w:val="2"/>
                 <w:sz w:val="20"/>
                 <w:szCs w:val="20"/>
-                <w:lang/>
                 <w14:ligatures w14:val="standardContextual"/>
               </w:rPr>
               <w:tab/>
@@ -2973,7 +2921,6 @@
               <w:kern w:val="2"/>
               <w:sz w:val="20"/>
               <w:szCs w:val="20"/>
-              <w:lang/>
               <w14:ligatures w14:val="standardContextual"/>
             </w:rPr>
           </w:pPr>
@@ -2993,7 +2940,6 @@
                 <w:kern w:val="2"/>
                 <w:sz w:val="20"/>
                 <w:szCs w:val="20"/>
-                <w:lang/>
                 <w14:ligatures w14:val="standardContextual"/>
               </w:rPr>
               <w:tab/>
@@ -3083,7 +3029,6 @@
               <w:kern w:val="2"/>
               <w:sz w:val="20"/>
               <w:szCs w:val="20"/>
-              <w:lang/>
               <w14:ligatures w14:val="standardContextual"/>
             </w:rPr>
           </w:pPr>
@@ -3103,7 +3048,6 @@
                 <w:kern w:val="2"/>
                 <w:sz w:val="20"/>
                 <w:szCs w:val="20"/>
-                <w:lang/>
                 <w14:ligatures w14:val="standardContextual"/>
               </w:rPr>
               <w:tab/>
@@ -3193,7 +3137,6 @@
               <w:kern w:val="2"/>
               <w:sz w:val="20"/>
               <w:szCs w:val="20"/>
-              <w:lang/>
               <w14:ligatures w14:val="standardContextual"/>
             </w:rPr>
           </w:pPr>
@@ -3213,7 +3156,6 @@
                 <w:kern w:val="2"/>
                 <w:sz w:val="20"/>
                 <w:szCs w:val="20"/>
-                <w:lang/>
                 <w14:ligatures w14:val="standardContextual"/>
               </w:rPr>
               <w:tab/>
@@ -3303,7 +3245,6 @@
               <w:kern w:val="2"/>
               <w:sz w:val="20"/>
               <w:szCs w:val="20"/>
-              <w:lang/>
               <w14:ligatures w14:val="standardContextual"/>
             </w:rPr>
           </w:pPr>
@@ -3323,7 +3264,6 @@
                 <w:kern w:val="2"/>
                 <w:sz w:val="20"/>
                 <w:szCs w:val="20"/>
-                <w:lang/>
                 <w14:ligatures w14:val="standardContextual"/>
               </w:rPr>
               <w:tab/>
@@ -3413,7 +3353,6 @@
               <w:kern w:val="2"/>
               <w:sz w:val="20"/>
               <w:szCs w:val="20"/>
-              <w:lang/>
               <w14:ligatures w14:val="standardContextual"/>
             </w:rPr>
           </w:pPr>
@@ -3433,7 +3372,6 @@
                 <w:kern w:val="2"/>
                 <w:sz w:val="20"/>
                 <w:szCs w:val="20"/>
-                <w:lang/>
                 <w14:ligatures w14:val="standardContextual"/>
               </w:rPr>
               <w:tab/>
@@ -3523,7 +3461,6 @@
               <w:kern w:val="2"/>
               <w:sz w:val="20"/>
               <w:szCs w:val="20"/>
-              <w:lang/>
               <w14:ligatures w14:val="standardContextual"/>
             </w:rPr>
           </w:pPr>
@@ -3543,7 +3480,6 @@
                 <w:kern w:val="2"/>
                 <w:sz w:val="20"/>
                 <w:szCs w:val="20"/>
-                <w:lang/>
                 <w14:ligatures w14:val="standardContextual"/>
               </w:rPr>
               <w:tab/>
@@ -3633,7 +3569,6 @@
               <w:kern w:val="2"/>
               <w:sz w:val="20"/>
               <w:szCs w:val="20"/>
-              <w:lang/>
               <w14:ligatures w14:val="standardContextual"/>
             </w:rPr>
           </w:pPr>
@@ -3653,7 +3588,6 @@
                 <w:kern w:val="2"/>
                 <w:sz w:val="20"/>
                 <w:szCs w:val="20"/>
-                <w:lang/>
                 <w14:ligatures w14:val="standardContextual"/>
               </w:rPr>
               <w:tab/>
@@ -3742,7 +3676,6 @@
               <w:kern w:val="2"/>
               <w:sz w:val="20"/>
               <w:szCs w:val="20"/>
-              <w:lang/>
               <w14:ligatures w14:val="standardContextual"/>
             </w:rPr>
           </w:pPr>
@@ -3831,7 +3764,6 @@
               <w:kern w:val="2"/>
               <w:sz w:val="20"/>
               <w:szCs w:val="20"/>
-              <w:lang/>
               <w14:ligatures w14:val="standardContextual"/>
             </w:rPr>
           </w:pPr>
@@ -3920,7 +3852,6 @@
               <w:kern w:val="2"/>
               <w:sz w:val="20"/>
               <w:szCs w:val="20"/>
-              <w:lang/>
               <w14:ligatures w14:val="standardContextual"/>
             </w:rPr>
           </w:pPr>
@@ -4126,7 +4057,6 @@
               <w:kern w:val="2"/>
               <w:sz w:val="20"/>
               <w:szCs w:val="20"/>
-              <w:lang/>
               <w14:ligatures w14:val="standardContextual"/>
             </w:rPr>
           </w:pPr>
@@ -4215,7 +4145,6 @@
               <w:kern w:val="2"/>
               <w:sz w:val="20"/>
               <w:szCs w:val="20"/>
-              <w:lang/>
               <w14:ligatures w14:val="standardContextual"/>
             </w:rPr>
           </w:pPr>
@@ -4308,13 +4237,13 @@
       <w:pPr>
         <w:pStyle w:val="Heading2"/>
       </w:pPr>
-      <w:bookmarkStart w:id="5" w:name="current-research"/>
-      <w:bookmarkStart w:id="6" w:name="_Toc233640828"/>
+      <w:bookmarkStart w:id="5" w:name="_Toc233640828"/>
+      <w:bookmarkStart w:id="6" w:name="current-research"/>
       <w:bookmarkEnd w:id="0"/>
       <w:r>
         <w:t>Introduction</w:t>
       </w:r>
-      <w:bookmarkEnd w:id="6"/>
+      <w:bookmarkEnd w:id="5"/>
     </w:p>
     <w:p>
       <w:pPr>
@@ -4448,15 +4377,15 @@
       <w:pPr>
         <w:pStyle w:val="Heading3"/>
       </w:pPr>
-      <w:bookmarkStart w:id="7" w:name="X842e24002b9edf666c3e01219695761036f973c"/>
-      <w:bookmarkStart w:id="8" w:name="_Toc233640829"/>
+      <w:bookmarkStart w:id="7" w:name="_Toc233640829"/>
+      <w:bookmarkStart w:id="8" w:name="X842e24002b9edf666c3e01219695761036f973c"/>
       <w:r>
         <w:t>Social</w:t>
       </w:r>
       <w:r>
         <w:t xml:space="preserve"> networks and relational event history data</w:t>
       </w:r>
-      <w:bookmarkEnd w:id="8"/>
+      <w:bookmarkEnd w:id="7"/>
     </w:p>
     <w:p>
       <w:pPr>
@@ -4972,13 +4901,13 @@
       <w:pPr>
         <w:pStyle w:val="Heading3"/>
       </w:pPr>
-      <w:bookmarkStart w:id="9" w:name="the-relational-event-model"/>
-      <w:bookmarkStart w:id="10" w:name="_Toc233640830"/>
-      <w:bookmarkEnd w:id="7"/>
+      <w:bookmarkStart w:id="9" w:name="_Toc233640830"/>
+      <w:bookmarkStart w:id="10" w:name="the-relational-event-model"/>
+      <w:bookmarkEnd w:id="8"/>
       <w:r>
         <w:t>The relational event model</w:t>
       </w:r>
-      <w:bookmarkEnd w:id="10"/>
+      <w:bookmarkEnd w:id="9"/>
     </w:p>
     <w:p>
       <w:pPr>
@@ -5263,13 +5192,13 @@
       <w:pPr>
         <w:pStyle w:val="Heading3"/>
       </w:pPr>
-      <w:bookmarkStart w:id="11" w:name="X0bb47a851f2f05886a451ca564bb808ff9705e5"/>
-      <w:bookmarkStart w:id="12" w:name="_Toc233640831"/>
-      <w:bookmarkEnd w:id="9"/>
+      <w:bookmarkStart w:id="11" w:name="_Toc233640831"/>
+      <w:bookmarkStart w:id="12" w:name="X0bb47a851f2f05886a451ca564bb808ff9705e5"/>
+      <w:bookmarkEnd w:id="10"/>
       <w:r>
         <w:t>The multi-receiver challenge and the Relational Hyperevent Model</w:t>
       </w:r>
-      <w:bookmarkEnd w:id="12"/>
+      <w:bookmarkEnd w:id="11"/>
     </w:p>
     <w:p>
       <w:pPr>
@@ -5924,14 +5853,14 @@
         <w:pStyle w:val="Heading3"/>
       </w:pPr>
       <w:bookmarkStart w:id="13" w:name="_Ref232774783"/>
-      <w:bookmarkStart w:id="14" w:name="methodological-grounding"/>
-      <w:bookmarkStart w:id="15" w:name="_Toc233640832"/>
-      <w:bookmarkEnd w:id="11"/>
+      <w:bookmarkStart w:id="14" w:name="_Toc233640832"/>
+      <w:bookmarkStart w:id="15" w:name="methodological-grounding"/>
+      <w:bookmarkEnd w:id="12"/>
       <w:r>
         <w:t>Methodological grounding</w:t>
       </w:r>
       <w:bookmarkEnd w:id="13"/>
-      <w:bookmarkEnd w:id="15"/>
+      <w:bookmarkEnd w:id="14"/>
     </w:p>
     <w:p>
       <w:pPr>
@@ -6070,7 +5999,7 @@
       </w:pPr>
       <w:bookmarkStart w:id="16" w:name="_Ref232774725"/>
       <w:bookmarkStart w:id="17" w:name="_Toc233640833"/>
-      <w:bookmarkEnd w:id="14"/>
+      <w:bookmarkEnd w:id="15"/>
       <w:r>
         <w:t>Current research</w:t>
       </w:r>
@@ -6217,13 +6146,13 @@
         <w:pStyle w:val="Heading2"/>
       </w:pPr>
       <w:bookmarkStart w:id="18" w:name="_Ref232774773"/>
-      <w:bookmarkStart w:id="19" w:name="results-and-analysis"/>
-      <w:bookmarkStart w:id="20" w:name="_Toc233640834"/>
+      <w:bookmarkStart w:id="19" w:name="_Toc233640834"/>
+      <w:bookmarkStart w:id="20" w:name="results-and-analysis"/>
       <w:r>
         <w:t>Methodology</w:t>
       </w:r>
       <w:bookmarkEnd w:id="18"/>
-      <w:bookmarkEnd w:id="20"/>
+      <w:bookmarkEnd w:id="19"/>
     </w:p>
     <w:p>
       <w:pPr>
@@ -6241,8 +6170,8 @@
       <w:bookmarkStart w:id="22" w:name="_Ref232773982"/>
       <w:bookmarkStart w:id="23" w:name="_Ref232773985"/>
       <w:bookmarkStart w:id="24" w:name="_Ref232774004"/>
-      <w:bookmarkStart w:id="25" w:name="X1cfe71ebbba0d487465ebd65418b93ffaea6582"/>
-      <w:bookmarkStart w:id="26" w:name="_Toc233640835"/>
+      <w:bookmarkStart w:id="25" w:name="_Toc233640835"/>
+      <w:bookmarkStart w:id="26" w:name="X1cfe71ebbba0d487465ebd65418b93ffaea6582"/>
       <w:r>
         <w:t>Data source and baseline data-generating process</w:t>
       </w:r>
@@ -6250,7 +6179,7 @@
       <w:bookmarkEnd w:id="22"/>
       <w:bookmarkEnd w:id="23"/>
       <w:bookmarkEnd w:id="24"/>
-      <w:bookmarkEnd w:id="26"/>
+      <w:bookmarkEnd w:id="25"/>
     </w:p>
     <w:p>
       <w:pPr>
@@ -8140,9 +8069,9 @@
       <w:bookmarkStart w:id="30" w:name="_Ref232774637"/>
       <w:bookmarkStart w:id="31" w:name="_Ref232774791"/>
       <w:bookmarkStart w:id="32" w:name="_Ref232774797"/>
-      <w:bookmarkStart w:id="33" w:name="multi-receiver-construction"/>
-      <w:bookmarkStart w:id="34" w:name="_Toc233640836"/>
-      <w:bookmarkEnd w:id="25"/>
+      <w:bookmarkStart w:id="33" w:name="_Toc233640836"/>
+      <w:bookmarkStart w:id="34" w:name="multi-receiver-construction"/>
+      <w:bookmarkEnd w:id="26"/>
       <w:r>
         <w:t>Multi-receiver construction</w:t>
       </w:r>
@@ -8151,7 +8080,7 @@
       <w:bookmarkEnd w:id="30"/>
       <w:bookmarkEnd w:id="31"/>
       <w:bookmarkEnd w:id="32"/>
-      <w:bookmarkEnd w:id="34"/>
+      <w:bookmarkEnd w:id="33"/>
     </w:p>
     <w:p>
       <w:pPr>
@@ -9131,9 +9060,9 @@
       <w:bookmarkStart w:id="37" w:name="_Ref232774511"/>
       <w:bookmarkStart w:id="38" w:name="_Ref232774543"/>
       <w:bookmarkStart w:id="39" w:name="_Ref232774591"/>
-      <w:bookmarkStart w:id="40" w:name="X2e0d55024ebbbe1beb2d890b82baea5782cff15"/>
-      <w:bookmarkStart w:id="41" w:name="_Toc233640837"/>
-      <w:bookmarkEnd w:id="33"/>
+      <w:bookmarkStart w:id="40" w:name="_Toc233640837"/>
+      <w:bookmarkStart w:id="41" w:name="X2e0d55024ebbbe1beb2d890b82baea5782cff15"/>
+      <w:bookmarkEnd w:id="34"/>
       <w:r>
         <w:t>Tie-breaking timestamp-noise transformation</w:t>
       </w:r>
@@ -9141,7 +9070,7 @@
       <w:bookmarkEnd w:id="37"/>
       <w:bookmarkEnd w:id="38"/>
       <w:bookmarkEnd w:id="39"/>
-      <w:bookmarkEnd w:id="41"/>
+      <w:bookmarkEnd w:id="40"/>
     </w:p>
     <w:p>
       <w:pPr>
@@ -10104,14 +10033,14 @@
         <w:pStyle w:val="Heading3"/>
       </w:pPr>
       <w:bookmarkStart w:id="42" w:name="_Ref232774597"/>
-      <w:bookmarkStart w:id="43" w:name="dyadic-rem-estimation"/>
-      <w:bookmarkStart w:id="44" w:name="_Toc233640838"/>
-      <w:bookmarkEnd w:id="40"/>
+      <w:bookmarkStart w:id="43" w:name="_Toc233640838"/>
+      <w:bookmarkStart w:id="44" w:name="dyadic-rem-estimation"/>
+      <w:bookmarkEnd w:id="41"/>
       <w:r>
         <w:t>Dyadic REM estimation</w:t>
       </w:r>
       <w:bookmarkEnd w:id="42"/>
-      <w:bookmarkEnd w:id="44"/>
+      <w:bookmarkEnd w:id="43"/>
     </w:p>
     <w:p>
       <w:pPr>
@@ -10532,15 +10461,15 @@
       </w:pPr>
       <w:bookmarkStart w:id="45" w:name="_Ref232774680"/>
       <w:bookmarkStart w:id="46" w:name="_Ref232774764"/>
-      <w:bookmarkStart w:id="47" w:name="rhem-benchmark"/>
-      <w:bookmarkStart w:id="48" w:name="_Toc233640839"/>
-      <w:bookmarkEnd w:id="43"/>
+      <w:bookmarkStart w:id="47" w:name="_Toc233640839"/>
+      <w:bookmarkStart w:id="48" w:name="rhem-benchmark"/>
+      <w:bookmarkEnd w:id="44"/>
       <w:r>
         <w:t>RHEM benchmark</w:t>
       </w:r>
       <w:bookmarkEnd w:id="45"/>
       <w:bookmarkEnd w:id="46"/>
-      <w:bookmarkEnd w:id="48"/>
+      <w:bookmarkEnd w:id="47"/>
     </w:p>
     <w:p>
       <w:pPr>
@@ -10669,9 +10598,9 @@
       <w:bookmarkStart w:id="52" w:name="_Ref232774649"/>
       <w:bookmarkStart w:id="53" w:name="_Ref232774672"/>
       <w:bookmarkStart w:id="54" w:name="_Ref232774832"/>
-      <w:bookmarkStart w:id="55" w:name="cross-dataset-replication"/>
-      <w:bookmarkStart w:id="56" w:name="_Toc233640840"/>
-      <w:bookmarkEnd w:id="47"/>
+      <w:bookmarkStart w:id="55" w:name="_Toc233640840"/>
+      <w:bookmarkStart w:id="56" w:name="cross-dataset-replication"/>
+      <w:bookmarkEnd w:id="48"/>
       <w:r>
         <w:t>Cross-dataset replication</w:t>
       </w:r>
@@ -10681,7 +10610,7 @@
       <w:bookmarkEnd w:id="52"/>
       <w:bookmarkEnd w:id="53"/>
       <w:bookmarkEnd w:id="54"/>
-      <w:bookmarkEnd w:id="56"/>
+      <w:bookmarkEnd w:id="55"/>
     </w:p>
     <w:p>
       <w:pPr>
@@ -10835,16 +10764,16 @@
       <w:bookmarkStart w:id="57" w:name="_Ref232774554"/>
       <w:bookmarkStart w:id="58" w:name="_Ref232774579"/>
       <w:bookmarkStart w:id="59" w:name="_Ref232774662"/>
-      <w:bookmarkStart w:id="60" w:name="X32f04f1dbe90b1c1090eb4357bcfe8be8c12f69"/>
-      <w:bookmarkStart w:id="61" w:name="_Toc233640841"/>
-      <w:bookmarkEnd w:id="55"/>
+      <w:bookmarkStart w:id="60" w:name="_Toc233640841"/>
+      <w:bookmarkStart w:id="61" w:name="X32f04f1dbe90b1c1090eb4357bcfe8be8c12f69"/>
+      <w:bookmarkEnd w:id="56"/>
       <w:r>
         <w:t>Acceptability rule and threshold determination</w:t>
       </w:r>
       <w:bookmarkEnd w:id="57"/>
       <w:bookmarkEnd w:id="58"/>
       <w:bookmarkEnd w:id="59"/>
-      <w:bookmarkEnd w:id="61"/>
+      <w:bookmarkEnd w:id="60"/>
     </w:p>
     <w:p>
       <w:pPr>
@@ -11752,8 +11681,8 @@
         <w:pStyle w:val="Heading2"/>
       </w:pPr>
       <w:bookmarkStart w:id="65" w:name="_Toc233640842"/>
-      <w:bookmarkEnd w:id="19"/>
-      <w:bookmarkEnd w:id="60"/>
+      <w:bookmarkEnd w:id="20"/>
+      <w:bookmarkEnd w:id="61"/>
       <w:bookmarkEnd w:id="64"/>
       <w:r>
         <w:t>Results and analysis</w:t>
@@ -11798,12 +11727,12 @@
       <w:pPr>
         <w:pStyle w:val="Heading3"/>
       </w:pPr>
-      <w:bookmarkStart w:id="66" w:name="per-effect-recovery-noise-bands"/>
-      <w:bookmarkStart w:id="67" w:name="_Toc233640843"/>
+      <w:bookmarkStart w:id="66" w:name="_Toc233640843"/>
+      <w:bookmarkStart w:id="67" w:name="per-effect-recovery-noise-bands"/>
       <w:r>
         <w:t>Per-effect recovery-noise bands</w:t>
       </w:r>
-      <w:bookmarkEnd w:id="67"/>
+      <w:bookmarkEnd w:id="66"/>
     </w:p>
     <w:p>
       <w:pPr>
@@ -12954,14 +12883,14 @@
         <w:pStyle w:val="Heading3"/>
       </w:pPr>
       <w:bookmarkStart w:id="69" w:name="_Ref232774710"/>
-      <w:bookmarkStart w:id="70" w:name="the-headline-threshold"/>
-      <w:bookmarkStart w:id="71" w:name="_Toc233640844"/>
-      <w:bookmarkEnd w:id="66"/>
+      <w:bookmarkStart w:id="70" w:name="_Toc233640844"/>
+      <w:bookmarkStart w:id="71" w:name="the-headline-threshold"/>
+      <w:bookmarkEnd w:id="67"/>
       <w:r>
         <w:t>The headline threshold</w:t>
       </w:r>
       <w:bookmarkEnd w:id="69"/>
-      <w:bookmarkEnd w:id="71"/>
+      <w:bookmarkEnd w:id="70"/>
     </w:p>
     <w:p>
       <w:pPr>
@@ -13319,16 +13248,16 @@
       <w:bookmarkStart w:id="72" w:name="_Ref232774699"/>
       <w:bookmarkStart w:id="73" w:name="_Ref232774716"/>
       <w:bookmarkStart w:id="74" w:name="_Ref232774814"/>
-      <w:bookmarkStart w:id="75" w:name="X30d72f27b33754429a8d32dda86dbc0fc5a1876"/>
-      <w:bookmarkStart w:id="76" w:name="_Toc233640845"/>
-      <w:bookmarkEnd w:id="70"/>
+      <w:bookmarkStart w:id="75" w:name="_Toc233640845"/>
+      <w:bookmarkStart w:id="76" w:name="X30d72f27b33754429a8d32dda86dbc0fc5a1876"/>
+      <w:bookmarkEnd w:id="71"/>
       <w:r>
         <w:t>Per-effect bias trajectories and the 12% boundary</w:t>
       </w:r>
       <w:bookmarkEnd w:id="72"/>
       <w:bookmarkEnd w:id="73"/>
       <w:bookmarkEnd w:id="74"/>
-      <w:bookmarkEnd w:id="76"/>
+      <w:bookmarkEnd w:id="75"/>
     </w:p>
     <w:p>
       <w:pPr>
@@ -14573,14 +14502,14 @@
         <w:pStyle w:val="Heading3"/>
       </w:pPr>
       <w:bookmarkStart w:id="77" w:name="_Ref232774734"/>
-      <w:bookmarkStart w:id="78" w:name="the-rhem-contextual-benchmark"/>
-      <w:bookmarkStart w:id="79" w:name="_Toc233640846"/>
-      <w:bookmarkEnd w:id="75"/>
+      <w:bookmarkStart w:id="78" w:name="_Toc233640846"/>
+      <w:bookmarkStart w:id="79" w:name="the-rhem-contextual-benchmark"/>
+      <w:bookmarkEnd w:id="76"/>
       <w:r>
         <w:t>The RHEM contextual benchmark</w:t>
       </w:r>
       <w:bookmarkEnd w:id="77"/>
-      <w:bookmarkEnd w:id="79"/>
+      <w:bookmarkEnd w:id="78"/>
     </w:p>
     <w:p>
       <w:pPr>
@@ -14785,15 +14714,15 @@
       </w:pPr>
       <w:bookmarkStart w:id="80" w:name="_Ref232774743"/>
       <w:bookmarkStart w:id="81" w:name="_Ref232774820"/>
-      <w:bookmarkStart w:id="82" w:name="the-baseline-rate"/>
-      <w:bookmarkStart w:id="83" w:name="_Toc233640847"/>
-      <w:bookmarkEnd w:id="78"/>
+      <w:bookmarkStart w:id="82" w:name="_Toc233640847"/>
+      <w:bookmarkStart w:id="83" w:name="the-baseline-rate"/>
+      <w:bookmarkEnd w:id="79"/>
       <w:r>
         <w:t>The baseline rate</w:t>
       </w:r>
       <w:bookmarkEnd w:id="80"/>
       <w:bookmarkEnd w:id="81"/>
-      <w:bookmarkEnd w:id="83"/>
+      <w:bookmarkEnd w:id="82"/>
     </w:p>
     <w:p>
       <w:pPr>
@@ -15312,13 +15241,13 @@
       <w:pPr>
         <w:pStyle w:val="Heading3"/>
       </w:pPr>
-      <w:bookmarkStart w:id="84" w:name="sensitivity-to-the-acceptability-rule"/>
-      <w:bookmarkStart w:id="85" w:name="_Toc233640848"/>
-      <w:bookmarkEnd w:id="82"/>
+      <w:bookmarkStart w:id="84" w:name="_Toc233640848"/>
+      <w:bookmarkStart w:id="85" w:name="sensitivity-to-the-acceptability-rule"/>
+      <w:bookmarkEnd w:id="83"/>
       <w:r>
         <w:t>Sensitivity to the acceptability rule</w:t>
       </w:r>
-      <w:bookmarkEnd w:id="85"/>
+      <w:bookmarkEnd w:id="84"/>
     </w:p>
     <w:p>
       <w:pPr>
@@ -15395,13 +15324,13 @@
       <w:pPr>
         <w:pStyle w:val="Heading2"/>
       </w:pPr>
-      <w:bookmarkStart w:id="86" w:name="conclusion-and-discussion"/>
-      <w:bookmarkStart w:id="87" w:name="_Toc233640849"/>
-      <w:bookmarkEnd w:id="84"/>
+      <w:bookmarkStart w:id="86" w:name="_Toc233640849"/>
+      <w:bookmarkStart w:id="87" w:name="conclusion-and-discussion"/>
+      <w:bookmarkEnd w:id="85"/>
       <w:r>
         <w:t>Conclusion and Discussion</w:t>
       </w:r>
-      <w:bookmarkEnd w:id="87"/>
+      <w:bookmarkEnd w:id="86"/>
     </w:p>
     <w:p>
       <w:pPr>
@@ -15424,13 +15353,13 @@
         <w:pStyle w:val="Heading3"/>
       </w:pPr>
       <w:bookmarkStart w:id="88" w:name="_Ref232774808"/>
-      <w:bookmarkStart w:id="89" w:name="X18afddcef9c7abf58b4728cf6836dba56af98ad"/>
-      <w:bookmarkStart w:id="90" w:name="_Toc233640850"/>
+      <w:bookmarkStart w:id="89" w:name="_Toc233640850"/>
+      <w:bookmarkStart w:id="90" w:name="X18afddcef9c7abf58b4728cf6836dba56af98ad"/>
       <w:r>
         <w:t>The multi-receiver threshold for parameter recovery</w:t>
       </w:r>
       <w:bookmarkEnd w:id="88"/>
-      <w:bookmarkEnd w:id="90"/>
+      <w:bookmarkEnd w:id="89"/>
     </w:p>
     <w:p>
       <w:pPr>
@@ -15489,14 +15418,14 @@
         <w:pStyle w:val="Heading3"/>
       </w:pPr>
       <w:bookmarkStart w:id="91" w:name="_Ref232774687"/>
-      <w:bookmarkStart w:id="92" w:name="Xfe9dfd041e7d1128c36ec0a589ca4a83b77570c"/>
-      <w:bookmarkStart w:id="93" w:name="_Toc233640851"/>
-      <w:bookmarkEnd w:id="89"/>
+      <w:bookmarkStart w:id="92" w:name="_Toc233640851"/>
+      <w:bookmarkStart w:id="93" w:name="Xfe9dfd041e7d1128c36ec0a589ca4a83b77570c"/>
+      <w:bookmarkEnd w:id="90"/>
       <w:r>
         <w:t>A three-zone operating range and the recommendation for applied work</w:t>
       </w:r>
       <w:bookmarkEnd w:id="91"/>
-      <w:bookmarkEnd w:id="93"/>
+      <w:bookmarkEnd w:id="92"/>
     </w:p>
     <w:p>
       <w:pPr>
@@ -15562,13 +15491,13 @@
       <w:pPr>
         <w:pStyle w:val="Heading3"/>
       </w:pPr>
-      <w:bookmarkStart w:id="94" w:name="implications-for-the-applied-domain"/>
-      <w:bookmarkStart w:id="95" w:name="_Toc233640852"/>
-      <w:bookmarkEnd w:id="92"/>
+      <w:bookmarkStart w:id="94" w:name="_Toc233640852"/>
+      <w:bookmarkStart w:id="95" w:name="implications-for-the-applied-domain"/>
+      <w:bookmarkEnd w:id="93"/>
       <w:r>
         <w:t>Implications for the applied domain</w:t>
       </w:r>
-      <w:bookmarkEnd w:id="95"/>
+      <w:bookmarkEnd w:id="94"/>
     </w:p>
     <w:p>
       <w:pPr>
@@ -15641,14 +15570,14 @@
         <w:pStyle w:val="Heading3"/>
       </w:pPr>
       <w:bookmarkStart w:id="96" w:name="_Ref232774753"/>
-      <w:bookmarkStart w:id="97" w:name="limitations"/>
-      <w:bookmarkStart w:id="98" w:name="_Toc233640853"/>
-      <w:bookmarkEnd w:id="94"/>
+      <w:bookmarkStart w:id="97" w:name="_Toc233640853"/>
+      <w:bookmarkStart w:id="98" w:name="limitations"/>
+      <w:bookmarkEnd w:id="95"/>
       <w:r>
         <w:t>Limitations</w:t>
       </w:r>
       <w:bookmarkEnd w:id="96"/>
-      <w:bookmarkEnd w:id="98"/>
+      <w:bookmarkEnd w:id="97"/>
     </w:p>
     <w:p>
       <w:pPr>
@@ -15744,7 +15673,38 @@
         </m:r>
       </m:oMath>
       <w:r>
-        <w:t xml:space="preserve"> grows (Table 3), and an exploratory check at </w:t>
+        <w:t xml:space="preserve"> grows (</w:t>
+      </w:r>
+      <w:r>
+        <w:fldChar w:fldCharType="begin"/>
+      </w:r>
+      <w:r>
+        <w:instrText xml:space="preserve"> REF _Ref232775201 \h </w:instrText>
+      </w:r>
+      <w:r>
+        <w:instrText xml:space="preserve"> \* MERGEFORMAT </w:instrText>
+      </w:r>
+      <w:r>
+        <w:fldChar w:fldCharType="separate"/>
+      </w:r>
+      <w:r>
+        <w:rPr>
+          <w:iCs/>
+        </w:rPr>
+        <w:t xml:space="preserve">Table </w:t>
+      </w:r>
+      <w:r>
+        <w:rPr>
+          <w:iCs/>
+          <w:noProof/>
+        </w:rPr>
+        <w:t>3</w:t>
+      </w:r>
+      <w:r>
+        <w:fldChar w:fldCharType="end"/>
+      </w:r>
+      <w:r>
+        <w:t xml:space="preserve">), and an exploratory check at </w:t>
       </w:r>
       <m:oMath>
         <m:r>
@@ -15844,15 +15804,7 @@
         </m:r>
       </m:oMath>
       <w:r>
-        <w:t xml:space="preserve"> setting rather than transported a</w:t>
-      </w:r>
-      <w:proofErr w:type="spellStart"/>
-      <w:r>
-        <w:t>s</w:t>
-      </w:r>
-      <w:proofErr w:type="spellEnd"/>
-      <w:r>
-        <w:t xml:space="preserve"> a constant. Every multi-receiver event here has exactly two receivers, so receiver-set cardinality is not varied. The small generating value of inertia is a property of cumulative-count inertia specifically; a decaying-memory operationalisation would bound the statistic and tolerate larger </w:t>
+        <w:t xml:space="preserve"> setting rather than transported as a constant. Every multi-receiver event here has exactly two receivers, so receiver-set cardinality is not varied. The small generating value of inertia is a property of cumulative-count inertia specifically; a decaying-memory operationalisation would bound the statistic and tolerate larger </w:t>
       </w:r>
       <w:proofErr w:type="gramStart"/>
       <w:r>
@@ -15867,13 +15819,13 @@
       <w:pPr>
         <w:pStyle w:val="Heading3"/>
       </w:pPr>
-      <w:bookmarkStart w:id="99" w:name="future-work"/>
-      <w:bookmarkStart w:id="100" w:name="_Toc233640854"/>
-      <w:bookmarkEnd w:id="97"/>
+      <w:bookmarkStart w:id="99" w:name="_Toc233640854"/>
+      <w:bookmarkStart w:id="100" w:name="future-work"/>
+      <w:bookmarkEnd w:id="98"/>
       <w:r>
         <w:t>Future work</w:t>
       </w:r>
-      <w:bookmarkEnd w:id="100"/>
+      <w:bookmarkEnd w:id="99"/>
     </w:p>
     <w:p>
       <w:pPr>
@@ -15931,13 +15883,13 @@
       <w:pPr>
         <w:pStyle w:val="Heading3"/>
       </w:pPr>
-      <w:bookmarkStart w:id="101" w:name="ethical-implications-and-considerations"/>
-      <w:bookmarkStart w:id="102" w:name="_Toc233640855"/>
-      <w:bookmarkEnd w:id="99"/>
+      <w:bookmarkStart w:id="101" w:name="_Toc233640855"/>
+      <w:bookmarkStart w:id="102" w:name="ethical-implications-and-considerations"/>
+      <w:bookmarkEnd w:id="100"/>
       <w:r>
         <w:t>Ethical implications and considerations</w:t>
       </w:r>
-      <w:bookmarkEnd w:id="102"/>
+      <w:bookmarkEnd w:id="101"/>
     </w:p>
     <w:p>
       <w:pPr>
@@ -15985,13 +15937,13 @@
       <w:pPr>
         <w:pStyle w:val="Heading3"/>
       </w:pPr>
-      <w:bookmarkStart w:id="103" w:name="conclusion"/>
-      <w:bookmarkStart w:id="104" w:name="_Toc233640856"/>
-      <w:bookmarkEnd w:id="101"/>
+      <w:bookmarkStart w:id="103" w:name="_Toc233640856"/>
+      <w:bookmarkStart w:id="104" w:name="conclusion"/>
+      <w:bookmarkEnd w:id="102"/>
       <w:r>
         <w:t>Conclusion</w:t>
       </w:r>
-      <w:bookmarkEnd w:id="104"/>
+      <w:bookmarkEnd w:id="103"/>
     </w:p>
     <w:p>
       <w:pPr>
@@ -16009,8 +15961,8 @@
         <w:t xml:space="preserve"> accordingly, are general. The result gives applied researchers a defensible reason to either keep using the familiar dyadic toolchain or to step beyond it, and a clear marker for which side of that line a given dataset falls on.</w:t>
       </w:r>
     </w:p>
-    <w:bookmarkEnd w:id="86"/>
-    <w:bookmarkEnd w:id="103"/>
+    <w:bookmarkEnd w:id="87"/>
+    <w:bookmarkEnd w:id="104"/>
     <w:p>
       <w:pPr>
         <w:jc w:val="left"/>
@@ -16019,7 +15971,7 @@
         <w:br w:type="page"/>
       </w:r>
     </w:p>
-    <w:bookmarkEnd w:id="5" w:displacedByCustomXml="next"/>
+    <w:bookmarkEnd w:id="6" w:displacedByCustomXml="next"/>
     <w:bookmarkStart w:id="105" w:name="_Toc233640857" w:displacedByCustomXml="next"/>
     <w:sdt>
       <w:sdtPr>
@@ -16937,12 +16889,12 @@
         </w:numPr>
         <w:ind w:left="397" w:hanging="397"/>
       </w:pPr>
-      <w:bookmarkStart w:id="129" w:name="Xda3e45e5656a73a30c0349908a7fadbced82d11"/>
-      <w:bookmarkStart w:id="130" w:name="_Toc233640858"/>
+      <w:bookmarkStart w:id="129" w:name="_Toc233640858"/>
+      <w:bookmarkStart w:id="130" w:name="Xda3e45e5656a73a30c0349908a7fadbced82d11"/>
       <w:r>
         <w:t>Appendix A. RHEM estimation configuration</w:t>
       </w:r>
-      <w:bookmarkEnd w:id="130"/>
+      <w:bookmarkEnd w:id="129"/>
     </w:p>
     <w:p>
       <w:pPr>
@@ -17188,9 +17140,9 @@
         </w:numPr>
         <w:ind w:left="397" w:hanging="397"/>
       </w:pPr>
-      <w:bookmarkStart w:id="131" w:name="X399cb8240eceeb6171121b8050db68d5b2c94a1"/>
-      <w:bookmarkStart w:id="132" w:name="_Toc233640859"/>
-      <w:bookmarkEnd w:id="129"/>
+      <w:bookmarkStart w:id="131" w:name="_Toc233640859"/>
+      <w:bookmarkStart w:id="132" w:name="X399cb8240eceeb6171121b8050db68d5b2c94a1"/>
+      <w:bookmarkEnd w:id="130"/>
       <w:r>
         <w:t xml:space="preserve">Appendix B. Derivation of the </w:t>
       </w:r>
@@ -17277,7 +17229,7 @@
           </m:sub>
         </m:sSub>
       </m:oMath>
-      <w:bookmarkEnd w:id="132"/>
+      <w:bookmarkEnd w:id="131"/>
     </w:p>
     <w:p>
       <w:pPr>
@@ -18081,13 +18033,13 @@
         </w:numPr>
         <w:ind w:left="397" w:hanging="397"/>
       </w:pPr>
-      <w:bookmarkStart w:id="133" w:name="appendix-c.-code-and-data-availability"/>
-      <w:bookmarkStart w:id="134" w:name="_Toc233640860"/>
-      <w:bookmarkEnd w:id="131"/>
+      <w:bookmarkStart w:id="133" w:name="_Toc233640860"/>
+      <w:bookmarkStart w:id="134" w:name="appendix-c.-code-and-data-availability"/>
+      <w:bookmarkEnd w:id="132"/>
       <w:r>
         <w:t>Appendix C. Code and data availability</w:t>
       </w:r>
-      <w:bookmarkEnd w:id="134"/>
+      <w:bookmarkEnd w:id="133"/>
     </w:p>
     <w:p>
       <w:pPr>
@@ -18104,19 +18056,7 @@
           <w:rPr>
             <w:rStyle w:val="Hyperlink"/>
           </w:rPr>
-          <w:t>https://github.com/GabrielSC92/Thesis-MSc-ADS-42</w:t>
-        </w:r>
-        <w:r>
-          <w:rPr>
-            <w:rStyle w:val="Hyperlink"/>
-          </w:rPr>
-          <w:t>6</w:t>
-        </w:r>
-        <w:r>
-          <w:rPr>
-            <w:rStyle w:val="Hyperlink"/>
-          </w:rPr>
-          <w:t>6390</w:t>
+          <w:t>https://github.com/GabrielSC92/Thesis-MSc-ADS-4266390</w:t>
         </w:r>
       </w:hyperlink>
       <w:r>
@@ -18140,7 +18080,7 @@
       <w:r>
         <w:t>), every number in the Results chapter can be regenerated from the seed list alone.</w:t>
       </w:r>
-      <w:bookmarkEnd w:id="133"/>
+      <w:bookmarkEnd w:id="134"/>
     </w:p>
     <w:p>
       <w:pPr>
@@ -18168,6 +18108,9 @@
         <w:pStyle w:val="BodyText"/>
       </w:pPr>
       <w:r>
+        <w:rPr>
+          <w:noProof/>
+        </w:rPr>
         <w:drawing>
           <wp:inline distT="0" distB="0" distL="0" distR="0" wp14:anchorId="1BB6C59E" wp14:editId="1C8028EE">
             <wp:extent cx="5943600" cy="6743700"/>
@@ -19222,6 +19165,7 @@
   <w:style w:type="character" w:default="1" w:styleId="DefaultParagraphFont">
     <w:name w:val="Default Paragraph Font"/>
     <w:uiPriority w:val="1"/>
+    <w:semiHidden/>
     <w:unhideWhenUsed/>
   </w:style>
   <w:style w:type="table" w:default="1" w:styleId="TableNormal">
@@ -20490,8 +20434,10 @@
     <w:rsid w:val="00705DF6"/>
     <w:rsid w:val="007C326E"/>
     <w:rsid w:val="007D7B9F"/>
+    <w:rsid w:val="00815691"/>
     <w:rsid w:val="00834CEE"/>
     <w:rsid w:val="008620EF"/>
+    <w:rsid w:val="00896BC6"/>
     <w:rsid w:val="009240A9"/>
     <w:rsid w:val="00A474B7"/>
     <w:rsid w:val="00A738BE"/>

</xml_diff>